<commit_message>
Ed7 aflevering 9 toegevoegd: leerfunctie publieke omroep (trekmechanisme); verbinding met 7 en 8
</commit_message>
<xml_diff>
--- a/assets/downloads-editie-7/editie7_aflevering-07-institutionele-voorwaarde.docx
+++ b/assets/downloads-editie-7/editie7_aflevering-07-institutionele-voorwaarde.docx
@@ -137,6 +137,26 @@
       </w:pPr>
       <w:r>
         <w:t xml:space="preserve">Een Europese economische bondsraad heeft één instrument dat geen enkele Commissie tot nu toe heeft ingezet: de maandelijkse publicatie van zes pagina’s gemeten feiten over de hefbomen, in vorm en taal die door brede pers kan worden overgenomen. Aflevering 8 beschrijft het mechanisme. Hier de institutionele verankering: de Bondsraad krijgt een eigen persdienst van vijftien tot twintig mensen — chemisch ingenieurs, journalisten, datavisualisatoren, oud-redacteuren — die niet PR doen maar feitenleveranciers zijn. Hun output is publiek, controleerbaar door de kennislaag (TNO, Fraunhofer, CNRS, planbureaus), en wordt elke maand verspreid naar dertig serieuze Europese kranten. Dit kost ongeveer drie miljoen euro per jaar — minder dan één procent van wat de huidige EU-communicatieafdelingen uitgeven aan brochures die niemand leest. Het effect: binnen drie jaar zijn Giant Juncao, BiCRS en plastic-opslag in dagbouwen bekende termen voor elke geletterde Europese burger. Binnen vijf jaar hebben de vakbonden zichzelf gecorrigeerd. Binnen acht jaar draaien de drie pilots commercieel.</w:t>
+      </w:r>
+    </w:p>
+    <w:p>
+      <w:pPr>
+        <w:pStyle w:val="BodyText"/>
+      </w:pPr>
+      <w:r>
+        <w:rPr>
+          <w:b/>
+          <w:bCs/>
+        </w:rPr>
+        <w:t xml:space="preserve">De leerfunctie van de publieke omroep</w:t>
+      </w:r>
+    </w:p>
+    <w:p>
+      <w:pPr>
+        <w:pStyle w:val="BodyText"/>
+      </w:pPr>
+      <w:r>
+        <w:t xml:space="preserve">Naast de persdienst van de Bondsraad bestaat er een tweede institutioneel instrument dat vandaag onderbenut wordt: de grondwettelijke leerfunctie van de publieke omroepen — NPO in Nederland, ARD/ZDF in Duitsland, BBC in het Verenigd Koninkrijk, Radio France in Frankrijk. Deze omroepen hebben een wettelijke educatieve verplichting waarvan zij vandaag minder dan tien procent benutten. De Bondsraad geeft jaarlijks vier of vijf thema’s mee voor pedagogische programmering; de omroepen behouden volledige redactionele vrijheid. Aflevering 9 werkt dit mechanisme volledig uit — niet als propaganda maar als hervinding van een al bestaande publieke functie. Het effect: gedeelde welvaartsgroei van de twee hefbomen wordt zichtbaar voor de bevolking, en de tegenstand bij vakbonden, gemeenten en politieke partijen verdwijnt niet door druk maar door erkenning van eigen belang.</w:t>
       </w:r>
     </w:p>
     <w:p>

</xml_diff>